<commit_message>
Add personal homepage link to CV
</commit_message>
<xml_diff>
--- a/files/Yang_Qiao_CV.docx
+++ b/files/Yang_Qiao_CV.docx
@@ -55,6 +55,20 @@
             <w:sz w:val="22"/>
           </w:rPr>
           <w:t>LinkedIn</w:t>
+        </w:r>
+      </w:hyperlink>
+      <w:r>
+        <w:t xml:space="preserve">  |  </w:t>
+      </w:r>
+      <w:hyperlink r:id="rId19">
+        <w:r>
+          <w:rPr>
+            <w:color w:val="000000"/>
+            <w:u w:val="none"/>
+            <w:rFonts w:ascii="Times New Roman" w:hAnsi="Times New Roman" w:eastAsia="Times New Roman" w:cs="Times New Roman"/>
+            <w:sz w:val="22"/>
+          </w:rPr>
+          <w:t>Homepage</w:t>
         </w:r>
       </w:hyperlink>
     </w:p>

</xml_diff>